<commit_message>
Create website to deploy
</commit_message>
<xml_diff>
--- a/Question_Evaluate/Question_Evaluate_20_07_26.docx
+++ b/Question_Evaluate/Question_Evaluate_20_07_26.docx
@@ -1240,84 +1240,6 @@
     </w:p>
     <w:p>
       <w:pPr>
-        <w:spacing w:before="40" w:after="40"/>
-      </w:pPr>
-    </w:p>
-    <w:p>
-      <w:pPr>
-        <w:shd w:val="clear" w:color="auto" w:fill="FFF2CC"/>
-        <w:spacing w:before="120" w:after="40"/>
-        <w:ind w:left="240"/>
-      </w:pPr>
-      <w:r>
-        <w:rPr>
-          <w:b/>
-          <w:i/>
-        </w:rPr>
-        <w:t xml:space="preserve"> NodeType (Activity vs DecisionGateway) có ảnh hưởng đến Độ Khó – nhưng khi đọc code từ repo thì đang xử lý type cho mỗi node chưa?</w:t>
-      </w:r>
-    </w:p>
-    <w:p>
-      <w:pPr>
-        <w:spacing w:before="40" w:after="40"/>
-        <w:ind w:left="240"/>
-      </w:pPr>
-      <w:r>
-        <w:rPr>
-          <w:b/>
-          <w:color w:val="375623"/>
-        </w:rPr>
-        <w:t>Đây là phát hiện quan trọng dẫn đến thêm tính năng tự phân loại NodeType.</w:t>
-      </w:r>
-    </w:p>
-    <w:p>
-      <w:pPr>
-        <w:spacing w:before="40" w:after="40"/>
-        <w:ind w:left="360"/>
-      </w:pPr>
-      <w:r>
-        <w:t>Trước đây khi xây dựng Workflow Graph, tất cả các node đều có NodeType = 'Activity' mặc định vì chưa có cơ chế phân loại. Hậu quả: Gateway Count luôn bằng 0, mọi câu hỏi đều bị phân loại là 'DỄ'.</w:t>
-      </w:r>
-    </w:p>
-    <w:p>
-      <w:pPr>
-        <w:spacing w:before="40" w:after="40"/>
-        <w:ind w:left="360"/>
-      </w:pPr>
-      <w:r>
-        <w:t>Giải pháp: Thêm hàm InferNodeType() phân loại tự động theo tên method:</w:t>
-      </w:r>
-    </w:p>
-    <w:p>
-      <w:pPr>
-        <w:spacing w:before="30" w:after="30"/>
-        <w:ind w:left="480"/>
-      </w:pPr>
-      <w:r>
-        <w:lastRenderedPageBreak/>
-        <w:t xml:space="preserve">  → DecisionGateway: Tên bắt đầu bằng Check, Validate, Should, Has, Is, Can hoặc chứa Decision, Gateway</w:t>
-      </w:r>
-    </w:p>
-    <w:p>
-      <w:pPr>
-        <w:spacing w:before="30" w:after="30"/>
-        <w:ind w:left="480"/>
-      </w:pPr>
-      <w:r>
-        <w:t xml:space="preserve">  → Activity: Tất cả trường hợp còn lại</w:t>
-      </w:r>
-    </w:p>
-    <w:p>
-      <w:pPr>
-        <w:spacing w:before="40" w:after="40"/>
-        <w:ind w:left="360"/>
-      </w:pPr>
-      <w:r>
-        <w:t>Phân loại này hoạt động rất tốt vì các best practices đặt tên method trong Java/C# thường tuân theo convention này.</w:t>
-      </w:r>
-    </w:p>
-    <w:p>
-      <w:pPr>
         <w:spacing w:before="240" w:after="100"/>
       </w:pPr>
       <w:r>
@@ -1386,6 +1308,7 @@
         <w:ind w:left="360"/>
       </w:pPr>
       <w:r>
+        <w:lastRenderedPageBreak/>
         <w:t>• TRUNG BÌNH: G_q = 1  (Single Exception path)</w:t>
       </w:r>
     </w:p>
@@ -1521,7 +1444,6 @@
         <w:ind w:left="360"/>
       </w:pPr>
       <w:r>
-        <w:lastRenderedPageBreak/>
         <w:t>Phát hiện Coverage và Accuracy có quy trình parse câu hỏi giống nhau. Tách toàn bộ Semantic Mapping vào ISemanticMappingHelper độc lập, đặt Cache vào đây để tránh gọi Cohere nhiều lần.</w:t>
       </w:r>
     </w:p>
@@ -1614,6 +1536,7 @@
         <w:ind w:left="360"/>
       </w:pPr>
       <w:r>
+        <w:lastRenderedPageBreak/>
         <w:t>Bổ sung chỉ số AccuracyScore định lượng (0.0–1.0) thay vì chỉ True/False, tính dựa trên tỷ lệ Valid Transitions / Total Transitions.</w:t>
       </w:r>
     </w:p>

</xml_diff>